<commit_message>
Verify Stage-3 numbers against published record; archive synthetic test file as G.8
- Uploaded TestData_Stage3_Pipeline_v1 is self-declared simulation output
  (README_SYNTHETIC sheet, TEST- IDs) and mismatches every published
  indicator; NOT used as study data
- Full audit: all Stage-3 figures in the thesis (Tables 6.1-6.3, Abstract,
  Ch2/6/8/9) verified consistent with the published Paper 3 aggregates;
  no contradictions found
- Table 6.3 per-band endorsement resolved as not preserved (only the
  71.7% total was published)
- Appendix G.8 added: the synthetic workbook archived explicitly as a
  pipeline-verification artifact, watermarked non-human

Co-Authored-By: Claude Fable 5 <noreply@anthropic.com>
Claude-Session: https://claude.ai/code/session_01KoT3i8geZspYBMMKVYJUTG
</commit_message>
<xml_diff>
--- a/docs/thesis/Tam_V7_EngD_Thesis_Final_Revision_Draft.docx
+++ b/docs/thesis/Tam_V7_EngD_Thesis_Final_Revision_Draft.docx
@@ -11762,11 +11762,7 @@
     </w:p>
     <w:p>
       <w:r>
-        <w:rPr>
-          <w:b/>
-          <w:highlight w:val="yellow"/>
-        </w:rPr>
-        <w:t>[AUTHOR INPUT REQUIRED: insert the per-age-band coordination-endorsement percentages in Table 6.3; the current draft records only the 71.7% total (86 of 120).]</w:t>
+        <w:t>Note on Table 6.3: coordination-challenge endorsement was reported in the published summary only as a total (86 of 120, 71.7%); the per-age-band breakdown was lost with the participant-level records and is shown as not preserved. No per-band endorsement claim is made in this thesis.</w:t>
       </w:r>
     </w:p>
     <w:p>
@@ -18038,6 +18034,11 @@
           <w:highlight w:val="yellow"/>
         </w:rPr>
         <w:t>[AUTHOR INPUT REQUIRED: attach archive]</w:t>
+      </w:r>
+    </w:p>
+    <w:p>
+      <w:r>
+        <w:t>G.8  Synthetic pipeline-test dataset (TestData_Stage3_Pipeline_v1_dates_corrected.xlsx): a simulation-generated workbook of 120 fictitious records (IDs TEST-001 to TEST-120, outside the study ID range) used to verify the Stage-3 logbook structure, formulas and analysis pipeline. Every sheet is watermarked as synthetic, and the workbook deliberately does not match the published aggregates. It is archived solely as a pipeline-verification artifact, in the same spirit as the synthetic centre-of-pressure traces of §5.3.9, and contains no data from any human participant.</w:t>
       </w:r>
     </w:p>
     <w:sectPr>

</xml_diff>